<commit_message>
deleted logsdb and updated the doumentation
</commit_message>
<xml_diff>
--- a/Secure_Distributed_Log_Analysis_Platform_Paper.docx
+++ b/Secure_Distributed_Log_Analysis_Platform_Paper.docx
@@ -163,7 +163,7 @@
         <w:t>Abstract</w:t>
       </w:r>
       <w:r>
-        <w:t xml:space="preserve">—This paper presents the Secure Distributed Log Analysis Platform, a comprehensive, enterprise-grade, event-driven architecture designed to simulate, ingest, process, and visualize network security logs in real-time. Modern organizations face an ever-growing volume of logs from servers, firewalls, and applications, making manual threat identification intractable. This platform addresses that challenge by implementing an end-to-end Big Data pipeline: distributed agents generate realistic network traffic (both benign and malicious), Apache Kafka brokers the high-throughput event stream, Apache Spark performs structured streaming and machine learning-based anomaly detection using an Isolation Forest model, and a Flask-based dashboard delivers real-time visualization via WebSockets. The system is capable of detecting zero-day anomalies beyond known attack signatures, including SQL injection, DDoS attempts, brute-force attacks, port scans, data exfiltration, XSS, and command injection. Results demonstrate that the fully containerized, microservices-based architecture achieves scalable, low-latency threat classification suitable for production security operations environments.</w:t>
+        <w:t xml:space="preserve">—This paper presents the Secure Distributed Log Analysis Platform, a comprehensive, enterprise-grade, event-driven architecture designed to simulate, ingest, process, and visualize network security logs in real-time. Modern organizations face an ever-growing volume of logs from servers, firewalls, and applications, making manual threat identification intractable. This platform addresses that challenge by implementing an end-to-end Big Data pipeline: distributed agents generate realistic network traffic (both benign and malicious), Apache Kafka brokers the high-throughput event stream, Apache Spark performs structured streaming and machine learning-based anomaly detection using an Isolation Forest model, and a Flask-based dashboard delivers real-time visualization via WebSockets. The system is capable of detecting zero-day anomalies beyond known attack signatures, including SQL injection, DDoS attempts, brute-force attacks, port scans, data exfiltration, XSS, command injection, privilege escalation, malware, and unauthorized access. Results demonstrate that the fully containerized, microservices-based architecture achieves scalable, low-latency threat classification suitable for production security operations environments.</w:t>
       </w:r>
     </w:p>
     <w:p>
@@ -425,7 +425,7 @@
         <w:pStyle w:val="BodyText"/>
       </w:pPr>
       <w:r>
-        <w:t xml:space="preserve">Normal traffic events include HTTP requests, SSH logins, DNS queries, DHCP leases, and NTP synchronizations. The generator injects anomalies at a configurable probability (default 15%) drawn from the following threat categories: SQL Injection (e.g., '; DROP TABLE users;--), DDoS Attempts (high-frequency requests from single IP addresses), Brute Force (repeated failed SSH login attempts), Port Scans, Data Exfiltration, XSS Attempts, and Command Injection. The </w:t>
+        <w:t xml:space="preserve">Normal traffic events include HTTP requests, SSH logins, DNS queries, DHCP leases, and NTP synchronizations. The generator injects anomalies at a configurable probability (default 15%) drawn from the following threat categories: SQL Injection (e.g., ’; DROP TABLE users;--), DDoS Attempts (high-frequency requests from single IP addresses), Brute Force (repeated failed SSH login attempts), Port Scans, Data Exfiltration, XSS Attempts, Command Injection, Privilege Escalation, Malware Detection, and Unauthorized Access. The </w:t>
       </w:r>
       <w:r>
         <w:rPr>
@@ -467,7 +467,7 @@
         <w:pStyle w:val="BodyText"/>
       </w:pPr>
       <w:r>
-        <w:t xml:space="preserve">This property enables the system to theoretically detect zero-day anomalies, such as unusual data exfiltration volumes or atypical port access patterns, even when they do not correspond to any known attack signature. The model is pre-trained via </w:t>
+        <w:t xml:space="preserve">This property enables the system to theoretically detect zero-day anomalies, such as unusual data exfiltration volumes or atypical port access patterns, even when they do not correspond to any known attack signature. The model is pre-trained on 10,000 synthetic log samples via </w:t>
       </w:r>
       <w:r>
         <w:rPr>
@@ -494,7 +494,79 @@
         <w:t>MODEL_CONTAMINATION</w:t>
       </w:r>
       <w:r>
-        <w:t xml:space="preserve"> controls the expected proportion of outliers in the training dataset and can be adjusted to match the characteristics of the target network environment.</w:t>
+        <w:t xml:space="preserve"> controls the expected proportion of outliers in the training dataset (default: 15%, matching the simulation’s configured attack injection rate) and can be adjusted to match the characteristics of the target network environment. Eight numerical features are extracted from each log record for model input: </w:t>
+      </w:r>
+      <w:r>
+        <w:rPr>
+          <w:i/>
+        </w:rPr>
+        <w:t xml:space="preserve">severity_score</w:t>
+      </w:r>
+      <w:r>
+        <w:t xml:space="preserve">, </w:t>
+      </w:r>
+      <w:r>
+        <w:rPr>
+          <w:i/>
+        </w:rPr>
+        <w:t>bytes_transferred</w:t>
+      </w:r>
+      <w:r>
+        <w:t xml:space="preserve">, </w:t>
+      </w:r>
+      <w:r>
+        <w:rPr>
+          <w:i/>
+        </w:rPr>
+        <w:t>port</w:t>
+      </w:r>
+      <w:r>
+        <w:t xml:space="preserve">, </w:t>
+      </w:r>
+      <w:r>
+        <w:rPr>
+          <w:i/>
+        </w:rPr>
+        <w:t>hour_of_day</w:t>
+      </w:r>
+      <w:r>
+        <w:t xml:space="preserve">, </w:t>
+      </w:r>
+      <w:r>
+        <w:rPr>
+          <w:i/>
+        </w:rPr>
+        <w:t>minute_of_hour</w:t>
+      </w:r>
+      <w:r>
+        <w:t xml:space="preserve">, </w:t>
+      </w:r>
+      <w:r>
+        <w:rPr>
+          <w:i/>
+        </w:rPr>
+        <w:t>is_privileged_port</w:t>
+      </w:r>
+      <w:r>
+        <w:t xml:space="preserve">, </w:t>
+      </w:r>
+      <w:r>
+        <w:rPr>
+          <w:i/>
+        </w:rPr>
+        <w:t>is_common_attack_port</w:t>
+      </w:r>
+      <w:r>
+        <w:t xml:space="preserve">, and </w:t>
+      </w:r>
+      <w:r>
+        <w:rPr>
+          <w:i/>
+        </w:rPr>
+        <w:t>request_length</w:t>
+      </w:r>
+      <w:r>
+        <w:t xml:space="preserve">. The model outputs an anomaly score and binary classification for each record.</w:t>
       </w:r>
     </w:p>
     <w:p>
@@ -552,16 +624,52 @@
         <w:pStyle w:val="BodyText"/>
       </w:pPr>
       <w:r>
-        <w:t xml:space="preserve">Prerequisites for running the platform are Docker, Docker Compose, and Python 3.8 or later. Deployment follows a three-stage startup sequence. First, the Kafka and Spark cluster is started via </w:t>
-      </w:r>
-      <w:r>
-        <w:rPr>
-          <w:i/>
-        </w:rPr>
-        <w:t>docker-compose up -d</w:t>
-      </w:r>
-      <w:r>
-        <w:t xml:space="preserve">. After the cluster becomes healthy and the Kafka initialization container has created the required topics, the Flask dashboard is launched via </w:t>
+        <w:t xml:space="preserve">Prerequisites for running the platform are Docker, Docker Compose, and Python 3.9–3.12 (recommended for local tooling). Java and Hadoop are not required on the host machine, as the Spark processor runs entirely inside Docker containers. Deployment follows a four-stage startup sequence. First, all Python dependencies are installed locally via </w:t>
+      </w:r>
+      <w:r>
+        <w:rPr>
+          <w:i/>
+        </w:rPr>
+        <w:t>pip install -r requirements.txt</w:t>
+      </w:r>
+      <w:r>
+        <w:t xml:space="preserve">. Second, the full infrastructure—Kafka broker, Spark cluster (master and worker), and three log-generation agents—is started via </w:t>
+      </w:r>
+      <w:r>
+        <w:rPr>
+          <w:i/>
+        </w:rPr>
+        <w:t>docker-compose up -d --build</w:t>
+      </w:r>
+      <w:r>
+        <w:t xml:space="preserve">; approximately 30 seconds are required for all services to become healthy and for the </w:t>
+      </w:r>
+      <w:r>
+        <w:rPr>
+          <w:i/>
+        </w:rPr>
+        <w:t>kafka-init</w:t>
+      </w:r>
+      <w:r>
+        <w:t xml:space="preserve"> container to create the required topics. Third, the Spark Structured Streaming job is submitted inside the </w:t>
+      </w:r>
+      <w:r>
+        <w:rPr>
+          <w:i/>
+        </w:rPr>
+        <w:t>spark-master</w:t>
+      </w:r>
+      <w:r>
+        <w:t xml:space="preserve"> container via </w:t>
+      </w:r>
+      <w:r>
+        <w:rPr>
+          <w:i/>
+        </w:rPr>
+        <w:t>spark-submit</w:t>
+      </w:r>
+      <w:r>
+        <w:t xml:space="preserve"> in a dedicated terminal; it automatically catches up on any logs buffered in Kafka during startup. Fourth, the Flask dashboard is launched via </w:t>
       </w:r>
       <w:r>
         <w:rPr>
@@ -570,7 +678,7 @@
         <w:t>python dashboard/app.py</w:t>
       </w:r>
       <w:r>
-        <w:t xml:space="preserve"> (accessible at </w:t>
+        <w:t xml:space="preserve"> in a separate terminal, making the interface accessible at </w:t>
       </w:r>
       <w:r>
         <w:rPr>
@@ -579,25 +687,7 @@
         <w:t>http://localhost:5000</w:t>
       </w:r>
       <w:r>
-        <w:t xml:space="preserve">). Next, the Spark processor is submitted inside the Spark Master container via </w:t>
-      </w:r>
-      <w:r>
-        <w:rPr>
-          <w:i/>
-        </w:rPr>
-        <w:t>spark-submit</w:t>
-      </w:r>
-      <w:r>
-        <w:t xml:space="preserve">. Since the agents are fully containerized, they start automatically with </w:t>
-      </w:r>
-      <w:r>
-        <w:rPr>
-          <w:i/>
-        </w:rPr>
-        <w:t>docker-compose up -d --build</w:t>
-      </w:r>
-      <w:r>
-        <w:t xml:space="preserve">. To dynamically scale agent nodes, run </w:t>
+        <w:t xml:space="preserve">. To dynamically scale agent nodes beyond the default three, run </w:t>
       </w:r>
       <w:r>
         <w:rPr>
@@ -616,6 +706,49 @@
       </w:r>
       <w:r>
         <w:t xml:space="preserve">. Events immediately appear on the live dashboard, with cyber threats highlighted in the Live Threat Feed.</w:t>
+      </w:r>
+    </w:p>
+    <w:p>
+      <w:pPr>
+        <w:pStyle w:val="Heading2"/>
+      </w:pPr>
+      <w:r>
+        <w:t>Data Synchronization and Persistence</w:t>
+      </w:r>
+    </w:p>
+    <w:p>
+      <w:pPr>
+        <w:pStyle w:val="BodyText"/>
+      </w:pPr>
+      <w:r>
+        <w:t xml:space="preserve">The platform is engineered to handle intermittent service interruptions without data loss. Kafka persists all event data in durable Docker volumes, ensuring messages are retained across restarts. The Spark processor uses a local </w:t>
+      </w:r>
+      <w:r>
+        <w:rPr>
+          <w:i/>
+        </w:rPr>
+        <w:t>./checkpoints</w:t>
+      </w:r>
+      <w:r>
+        <w:t xml:space="preserve"> directory to checkpoint its stream position; upon restart it resumes exactly where it left off without reprocessing prior records. The Flask dashboard applies an </w:t>
+      </w:r>
+      <w:r>
+        <w:rPr>
+          <w:i/>
+        </w:rPr>
+        <w:t>earliest</w:t>
+      </w:r>
+      <w:r>
+        <w:t xml:space="preserve"> consumer offset policy, automatically fetching recent history from the local SQLite database on load to ensure no processed logs are missed during downtime. To prevent duplication when agent sequences reset across runs, the database enforces a unique constraint on the composite key </w:t>
+      </w:r>
+      <w:r>
+        <w:rPr>
+          <w:i/>
+        </w:rPr>
+        <w:t>(agent, sequence, timestamp)</w:t>
+      </w:r>
+      <w:r>
+        <w:t xml:space="preserve">, deduplicating exact replays while still accepting new records from fresh agent runs.</w:t>
       </w:r>
     </w:p>
     <w:p>

</xml_diff>